<commit_message>
feat: evolve profile and enterprise CV
</commit_message>
<xml_diff>
--- a/public/cv/Dessi_Georgieva_CV.docx
+++ b/public/cv/Dessi_Georgieva_CV.docx
@@ -18,7 +18,7 @@
         <w:pStyle w:val="CVHeadline"/>
       </w:pPr>
       <w:r>
-        <w:t>AI Systems Engineer</w:t>
+        <w:t>AI Systems Engineer · Enterprise Agents and Applied AI</w:t>
       </w:r>
     </w:p>
     <w:p>
@@ -122,342 +122,6 @@
         <w:pStyle w:val="Heading1"/>
       </w:pPr>
       <w:r>
-        <w:t>AI Systems Capabilities</w:t>
-      </w:r>
-    </w:p>
-    <w:p>
-      <w:pPr>
-        <w:pStyle w:val="CVBullet"/>
-      </w:pPr>
-      <w:r>
-        <w:t xml:space="preserve">• </w:t>
-      </w:r>
-      <w:r>
-        <w:rPr>
-          <w:b/>
-          <w:i w:val="0"/>
-        </w:rPr>
-        <w:t>AI operating environments:</w:t>
-      </w:r>
-      <w:r>
-        <w:rPr>
-          <w:i w:val="0"/>
-        </w:rPr>
-        <w:t xml:space="preserve"> Design the people, agents, tools, data, rules, and surrounding systems that must work together to produce a useful result.</w:t>
-      </w:r>
-    </w:p>
-    <w:p>
-      <w:pPr>
-        <w:pStyle w:val="CVBullet"/>
-      </w:pPr>
-      <w:r>
-        <w:t xml:space="preserve">• </w:t>
-      </w:r>
-      <w:r>
-        <w:rPr>
-          <w:b/>
-          <w:i w:val="0"/>
-        </w:rPr>
-        <w:t>Context, memory, and capabilities:</w:t>
-      </w:r>
-      <w:r>
-        <w:rPr>
-          <w:i w:val="0"/>
-        </w:rPr>
-        <w:t xml:space="preserve"> Give agents the right information and reusable procedures for each task, with clear sources, scope, and limits.</w:t>
-      </w:r>
-    </w:p>
-    <w:p>
-      <w:pPr>
-        <w:pStyle w:val="CVBullet"/>
-      </w:pPr>
-      <w:r>
-        <w:t xml:space="preserve">• </w:t>
-      </w:r>
-      <w:r>
-        <w:rPr>
-          <w:b/>
-          <w:i w:val="0"/>
-        </w:rPr>
-        <w:t>Authority and human attention:</w:t>
-      </w:r>
-      <w:r>
-        <w:rPr>
-          <w:i w:val="0"/>
-        </w:rPr>
-        <w:t xml:space="preserve"> Define what an agent may decide, when it must ask, and how identity, permissions, approvals, and consequential actions stay under human and system control.</w:t>
-      </w:r>
-    </w:p>
-    <w:p>
-      <w:pPr>
-        <w:pStyle w:val="CVBullet"/>
-      </w:pPr>
-      <w:r>
-        <w:t xml:space="preserve">• </w:t>
-      </w:r>
-      <w:r>
-        <w:rPr>
-          <w:b/>
-          <w:i w:val="0"/>
-        </w:rPr>
-        <w:t>Evaluation and learning:</w:t>
-      </w:r>
-      <w:r>
-        <w:rPr>
-          <w:i w:val="0"/>
-        </w:rPr>
-        <w:t xml:space="preserve"> Test components, interactions, and end results, then turn failures, feedback, and observed outcomes into changes that can be reviewed and reversed.</w:t>
-      </w:r>
-    </w:p>
-    <w:p>
-      <w:pPr>
-        <w:pStyle w:val="CVBullet"/>
-      </w:pPr>
-      <w:r>
-        <w:t xml:space="preserve">• </w:t>
-      </w:r>
-      <w:r>
-        <w:rPr>
-          <w:b/>
-          <w:i w:val="0"/>
-        </w:rPr>
-        <w:t>Reliability and recovery:</w:t>
-      </w:r>
-      <w:r>
-        <w:rPr>
-          <w:i w:val="0"/>
-        </w:rPr>
-        <w:t xml:space="preserve"> Make long-running work observable and recoverable through explicit state, budgets, retries, receipts, fallback, cancellation, and rollback.</w:t>
-      </w:r>
-    </w:p>
-    <w:p>
-      <w:pPr>
-        <w:pStyle w:val="Heading1"/>
-      </w:pPr>
-      <w:r>
-        <w:t>Selected Systems</w:t>
-      </w:r>
-    </w:p>
-    <w:p>
-      <w:pPr>
-        <w:pStyle w:val="Heading2"/>
-      </w:pPr>
-      <w:r>
-        <w:t>Agentic Commerce Learning Loop</w:t>
-      </w:r>
-    </w:p>
-    <w:p>
-      <w:pPr>
-        <w:spacing w:after="40"/>
-      </w:pPr>
-      <w:r>
-        <w:rPr>
-          <w:i/>
-        </w:rPr>
-        <w:t xml:space="preserve">Collaborative public system · Active · </w:t>
-      </w:r>
-      <w:hyperlink r:id="rId15">
-        <w:r>
-          <w:rPr>
-            <w:color w:val="2E74B5"/>
-            <w:u w:val="single"/>
-            <w:i/>
-          </w:rPr>
-          <w:t>Repository</w:t>
-        </w:r>
-      </w:hyperlink>
-    </w:p>
-    <w:p>
-      <w:pPr>
-        <w:pStyle w:val="CVBullet"/>
-      </w:pPr>
-      <w:r>
-        <w:t xml:space="preserve">• </w:t>
-      </w:r>
-      <w:r>
-        <w:rPr>
-          <w:i w:val="0"/>
-        </w:rPr>
-        <w:t>I built Agentic Commerce to help brands test and improve how they describe products for paid placements and organic agent-led discovery, without giving an AI system unchecked control over business actions.</w:t>
-      </w:r>
-    </w:p>
-    <w:p>
-      <w:pPr>
-        <w:pStyle w:val="CVBullet"/>
-      </w:pPr>
-      <w:r>
-        <w:t xml:space="preserve">• </w:t>
-      </w:r>
-      <w:r>
-        <w:rPr>
-          <w:i w:val="0"/>
-        </w:rPr>
-        <w:t>I designed a Bayesian-style learning loop that updates brand- and product-scoped beliefs as evidence arrives and carries supported patterns into later query and copy generation. It recommends whether to promote, revise, or reject each variant, while the supervised runtime keeps tools, evidence, memory, approvals, and recovery under explicit control.</w:t>
-      </w:r>
-    </w:p>
-    <w:p>
-      <w:pPr>
-        <w:pStyle w:val="Heading2"/>
-      </w:pPr>
-      <w:r>
-        <w:t>Gateplane Agent Control Plane</w:t>
-      </w:r>
-    </w:p>
-    <w:p>
-      <w:pPr>
-        <w:spacing w:after="40"/>
-      </w:pPr>
-      <w:r>
-        <w:rPr>
-          <w:i/>
-        </w:rPr>
-        <w:t xml:space="preserve">Independent deployed beta · Private source · </w:t>
-      </w:r>
-      <w:hyperlink r:id="rId16">
-        <w:r>
-          <w:rPr>
-            <w:color w:val="2E74B5"/>
-            <w:u w:val="single"/>
-            <w:i/>
-          </w:rPr>
-          <w:t>Public overview</w:t>
-        </w:r>
-      </w:hyperlink>
-    </w:p>
-    <w:p>
-      <w:pPr>
-        <w:pStyle w:val="CVBullet"/>
-      </w:pPr>
-      <w:r>
-        <w:t xml:space="preserve">• </w:t>
-      </w:r>
-      <w:r>
-        <w:rPr>
-          <w:i w:val="0"/>
-        </w:rPr>
-        <w:t>I developed Gateplane independently to explore how authenticated human or agent identity becomes bounded, tenant-aware authority for tools and external effects.</w:t>
-      </w:r>
-    </w:p>
-    <w:p>
-      <w:pPr>
-        <w:pStyle w:val="CVBullet"/>
-      </w:pPr>
-      <w:r>
-        <w:t xml:space="preserve">• </w:t>
-      </w:r>
-      <w:r>
-        <w:rPr>
-          <w:i w:val="0"/>
-        </w:rPr>
-        <w:t>The product overview is public; source code and provisioned access remain private, and employer deployment or production adoption is not claimed.</w:t>
-      </w:r>
-    </w:p>
-    <w:p>
-      <w:pPr>
-        <w:pStyle w:val="Heading2"/>
-      </w:pPr>
-      <w:r>
-        <w:t>Human Systems Platform</w:t>
-      </w:r>
-    </w:p>
-    <w:p>
-      <w:pPr>
-        <w:spacing w:after="40"/>
-      </w:pPr>
-      <w:r>
-        <w:rPr>
-          <w:i/>
-        </w:rPr>
-        <w:t xml:space="preserve">Founder product · Private development · </w:t>
-      </w:r>
-      <w:hyperlink r:id="rId13">
-        <w:r>
-          <w:rPr>
-            <w:color w:val="2E74B5"/>
-            <w:u w:val="single"/>
-            <w:i/>
-          </w:rPr>
-          <w:t>First public product</w:t>
-        </w:r>
-      </w:hyperlink>
-    </w:p>
-    <w:p>
-      <w:pPr>
-        <w:pStyle w:val="CVBullet"/>
-      </w:pPr>
-      <w:r>
-        <w:t xml:space="preserve">• </w:t>
-      </w:r>
-      <w:r>
-        <w:rPr>
-          <w:i w:val="0"/>
-        </w:rPr>
-        <w:t>I am developing Human Systems Platform as a founder-led product for people and organisations that need credible evidence of capability in AI-mediated work. It turns selected experience into private learning, owner-approved public evidence, and testable hypotheses about where that capability may create value.</w:t>
-      </w:r>
-    </w:p>
-    <w:p>
-      <w:pPr>
-        <w:pStyle w:val="CVBullet"/>
-      </w:pPr>
-      <w:r>
-        <w:t xml:space="preserve">• </w:t>
-      </w:r>
-      <w:r>
-        <w:rPr>
-          <w:i w:val="0"/>
-        </w:rPr>
-        <w:t>I designed it to bring together Dessi Space for private continuity, Learning Foundry for human and agent development, DG-OS for public profiles and discovery, and a planned Organization Foundry for the context organisations need.</w:t>
-      </w:r>
-    </w:p>
-    <w:p>
-      <w:pPr>
-        <w:pStyle w:val="Heading2"/>
-      </w:pPr>
-      <w:r>
-        <w:t>Learning Foundry</w:t>
-      </w:r>
-    </w:p>
-    <w:p>
-      <w:pPr>
-        <w:spacing w:after="40"/>
-      </w:pPr>
-      <w:r>
-        <w:rPr>
-          <w:i/>
-        </w:rPr>
-        <w:t xml:space="preserve">Submitted public system · Judging state preserved · </w:t>
-      </w:r>
-      <w:hyperlink r:id="rId17">
-        <w:r>
-          <w:rPr>
-            <w:color w:val="2E74B5"/>
-            <w:u w:val="single"/>
-            <w:i/>
-          </w:rPr>
-          <w:t>Repository at submitted commit</w:t>
-        </w:r>
-      </w:hyperlink>
-    </w:p>
-    <w:p>
-      <w:pPr>
-        <w:pStyle w:val="CVBullet"/>
-      </w:pPr>
-      <w:r>
-        <w:t xml:space="preserve">• </w:t>
-      </w:r>
-      <w:r>
-        <w:rPr>
-          <w:i w:val="0"/>
-        </w:rPr>
-        <w:t>I built Learning Foundry as a stand-alone learning product for people who want to learn with AI without treating an agent's successful output as proof of their own understanding. It helps them explain, test, apply, and revise what they learn while separately developing evaluated agent capabilities.</w:t>
-      </w:r>
-    </w:p>
-    <w:p>
-      <w:pPr>
-        <w:pStyle w:val="Heading1"/>
-        <w:pageBreakBefore/>
-      </w:pPr>
-      <w:r>
         <w:t>Experience</w:t>
       </w:r>
     </w:p>
@@ -498,7 +162,7 @@
         <w:rPr>
           <w:i w:val="0"/>
         </w:rPr>
-        <w:t>I map production request-to-response lifecycles and am leading architecture work for evidence-led final-answer validation; this remains in delivery rather than a deployed control.</w:t>
+        <w:t>I architected and evolved a production Programmatic agent platform used by internal agency teams across three major global advertiser accounts, taking it from prototype through changing engineering and user requirements.</w:t>
       </w:r>
     </w:p>
     <w:p>
@@ -512,7 +176,7 @@
         <w:rPr>
           <w:i w:val="0"/>
         </w:rPr>
-        <w:t>I architect and build the Programmatic plugin and agent harness that turns ambiguous user requests into tenant-bound execution across skills, a typed CLI, backend services, analytical data, and advertising-platform APIs.</w:t>
+        <w:t>I designed its provider-neutral CLI grammar and orchestration across Claude Agent SDK on AWS Bedrock AgentCore, Lambda services, analytical data, and hierarchical DV360 and TTD APIs, while deterministic controls retain tenant scope, evidence, approvals, and provider writes.</w:t>
       </w:r>
     </w:p>
     <w:p>
@@ -526,7 +190,7 @@
         <w:rPr>
           <w:i w:val="0"/>
         </w:rPr>
-        <w:t>I build backend ingestion and serving workflows for heterogeneous advertising data across provider hierarchies and analytical grains, and evaluate storage architecture against query shape, aggregation, latency, reliability, and cost.</w:t>
+        <w:t>I built configuration-driven advertiser onboarding and ingestion workflows that replace spreadsheet-led enablement and remove at least three days of cross-team coordination from each onboarding cycle.</w:t>
       </w:r>
     </w:p>
     <w:p>
@@ -540,7 +204,35 @@
         <w:rPr>
           <w:i w:val="0"/>
         </w:rPr>
-        <w:t>I delivered backend services and cloud data workflows for an award-recognised ecommerce optimisation platform.</w:t>
+        <w:t>I designed routing and correctness evaluations for the agent; the production platform combines those checks with AgentCore traces, CloudWatch, PostHog, and automated measures for tool use, grounding, latency, and cost.</w:t>
+      </w:r>
+    </w:p>
+    <w:p>
+      <w:pPr>
+        <w:pStyle w:val="CVBullet"/>
+      </w:pPr>
+      <w:r>
+        <w:t xml:space="preserve">• </w:t>
+      </w:r>
+      <w:r>
+        <w:rPr>
+          <w:i w:val="0"/>
+        </w:rPr>
+        <w:t>I translated agency-user requirements into tenant-scoped CLI workflows for creating, persisting, versioning, and sharing campaign playbooks that users can maintain as their operating practice changes.</w:t>
+      </w:r>
+    </w:p>
+    <w:p>
+      <w:pPr>
+        <w:pStyle w:val="CVBullet"/>
+      </w:pPr>
+      <w:r>
+        <w:t xml:space="preserve">• </w:t>
+      </w:r>
+      <w:r>
+        <w:rPr>
+          <w:i w:val="0"/>
+        </w:rPr>
+        <w:t>I build backend ingestion and serving workflows for advertising datasets that can reach millions of records across provider hierarchies and analytical grains, and evaluate storage architecture against query shape, aggregation, latency, reliability, and cost.</w:t>
       </w:r>
     </w:p>
     <w:p>
@@ -674,7 +366,300 @@
         <w:rPr>
           <w:i w:val="0"/>
         </w:rPr>
-        <w:t>I delivered CRM, analytics, segmentation, automation, and experimentation systems for agencies, startups, and media organisations.</w:t>
+        <w:t>I worked directly with agency, startup, and media clients to translate business requirements into CRM, analytics, segmentation, automation, and experimentation systems.</w:t>
+      </w:r>
+    </w:p>
+    <w:p>
+      <w:pPr>
+        <w:pStyle w:val="Heading1"/>
+        <w:pageBreakBefore/>
+      </w:pPr>
+      <w:r>
+        <w:t>AI Systems Capabilities</w:t>
+      </w:r>
+    </w:p>
+    <w:p>
+      <w:pPr>
+        <w:pStyle w:val="CVBullet"/>
+      </w:pPr>
+      <w:r>
+        <w:t xml:space="preserve">• </w:t>
+      </w:r>
+      <w:r>
+        <w:rPr>
+          <w:b/>
+          <w:i w:val="0"/>
+        </w:rPr>
+        <w:t>Customer discovery and productisation:</w:t>
+      </w:r>
+      <w:r>
+        <w:rPr>
+          <w:i w:val="0"/>
+        </w:rPr>
+        <w:t xml:space="preserve"> Translate operational needs, user feedback, and integration constraints into prototypes that can become reusable production capabilities.</w:t>
+      </w:r>
+    </w:p>
+    <w:p>
+      <w:pPr>
+        <w:pStyle w:val="CVBullet"/>
+      </w:pPr>
+      <w:r>
+        <w:t xml:space="preserve">• </w:t>
+      </w:r>
+      <w:r>
+        <w:rPr>
+          <w:b/>
+          <w:i w:val="0"/>
+        </w:rPr>
+        <w:t>Agent architecture and integration:</w:t>
+      </w:r>
+      <w:r>
+        <w:rPr>
+          <w:i w:val="0"/>
+        </w:rPr>
+        <w:t xml:space="preserve"> Connect model reasoning to skills, typed tools, cloud services, provider APIs, retrieval, and analytical data without making each new intent a bespoke workflow.</w:t>
+      </w:r>
+    </w:p>
+    <w:p>
+      <w:pPr>
+        <w:pStyle w:val="CVBullet"/>
+      </w:pPr>
+      <w:r>
+        <w:t xml:space="preserve">• </w:t>
+      </w:r>
+      <w:r>
+        <w:rPr>
+          <w:b/>
+          <w:i w:val="0"/>
+        </w:rPr>
+        <w:t>Evaluation and observability:</w:t>
+      </w:r>
+      <w:r>
+        <w:rPr>
+          <w:i w:val="0"/>
+        </w:rPr>
+        <w:t xml:space="preserve"> Measure routing, correctness, grounding, tool use, latency, and cost, then use traces and user feedback to diagnose failures and prevent regression.</w:t>
+      </w:r>
+    </w:p>
+    <w:p>
+      <w:pPr>
+        <w:pStyle w:val="CVBullet"/>
+      </w:pPr>
+      <w:r>
+        <w:t xml:space="preserve">• </w:t>
+      </w:r>
+      <w:r>
+        <w:rPr>
+          <w:b/>
+          <w:i w:val="0"/>
+        </w:rPr>
+        <w:t>Cloud delivery and reliability:</w:t>
+      </w:r>
+      <w:r>
+        <w:rPr>
+          <w:i w:val="0"/>
+        </w:rPr>
+        <w:t xml:space="preserve"> Ship through automated environments with explicit deployment checks, smoke tests, runtime monitoring, rollback, and recovery paths.</w:t>
+      </w:r>
+    </w:p>
+    <w:p>
+      <w:pPr>
+        <w:pStyle w:val="CVBullet"/>
+      </w:pPr>
+      <w:r>
+        <w:t xml:space="preserve">• </w:t>
+      </w:r>
+      <w:r>
+        <w:rPr>
+          <w:b/>
+          <w:i w:val="0"/>
+        </w:rPr>
+        <w:t>Authority and safety:</w:t>
+      </w:r>
+      <w:r>
+        <w:rPr>
+          <w:i w:val="0"/>
+        </w:rPr>
+        <w:t xml:space="preserve"> Keep tenant scope, permissions, approvals, evidence, provider writes, and consequential effects under deterministic control while models interpret and propose.</w:t>
+      </w:r>
+    </w:p>
+    <w:p>
+      <w:pPr>
+        <w:pStyle w:val="Heading1"/>
+      </w:pPr>
+      <w:r>
+        <w:t>Selected Systems</w:t>
+      </w:r>
+    </w:p>
+    <w:p>
+      <w:pPr>
+        <w:pStyle w:val="Heading2"/>
+      </w:pPr>
+      <w:r>
+        <w:t>Agentic Commerce Learning Loop</w:t>
+      </w:r>
+    </w:p>
+    <w:p>
+      <w:pPr>
+        <w:spacing w:after="40"/>
+      </w:pPr>
+      <w:r>
+        <w:rPr>
+          <w:i/>
+        </w:rPr>
+        <w:t xml:space="preserve">Collaborative public system · Active · </w:t>
+      </w:r>
+      <w:hyperlink r:id="rId15">
+        <w:r>
+          <w:rPr>
+            <w:color w:val="2E74B5"/>
+            <w:u w:val="single"/>
+            <w:i/>
+          </w:rPr>
+          <w:t>Repository</w:t>
+        </w:r>
+      </w:hyperlink>
+    </w:p>
+    <w:p>
+      <w:pPr>
+        <w:pStyle w:val="CVBullet"/>
+      </w:pPr>
+      <w:r>
+        <w:t xml:space="preserve">• </w:t>
+      </w:r>
+      <w:r>
+        <w:rPr>
+          <w:i w:val="0"/>
+        </w:rPr>
+        <w:t>I built Agentic Commerce to help brands test and improve how they describe products for paid placements and organic agent-led discovery, without giving an AI system unchecked control over business actions.</w:t>
+      </w:r>
+    </w:p>
+    <w:p>
+      <w:pPr>
+        <w:pStyle w:val="CVBullet"/>
+      </w:pPr>
+      <w:r>
+        <w:t xml:space="preserve">• </w:t>
+      </w:r>
+      <w:r>
+        <w:rPr>
+          <w:i w:val="0"/>
+        </w:rPr>
+        <w:t>I designed a Bayesian-style learning loop that updates brand- and product-scoped beliefs as evidence arrives and carries supported patterns into later query and copy generation. It recommends whether to promote, revise, or reject each variant, while the supervised runtime keeps tools, evidence, memory, approvals, and recovery under explicit control.</w:t>
+      </w:r>
+    </w:p>
+    <w:p>
+      <w:pPr>
+        <w:pStyle w:val="Heading2"/>
+      </w:pPr>
+      <w:r>
+        <w:t>Gateplane Agent Control Plane</w:t>
+      </w:r>
+    </w:p>
+    <w:p>
+      <w:pPr>
+        <w:spacing w:after="40"/>
+      </w:pPr>
+      <w:r>
+        <w:rPr>
+          <w:i/>
+        </w:rPr>
+        <w:t xml:space="preserve">Independent deployed beta · Private source · </w:t>
+      </w:r>
+      <w:hyperlink r:id="rId16">
+        <w:r>
+          <w:rPr>
+            <w:color w:val="2E74B5"/>
+            <w:u w:val="single"/>
+            <w:i/>
+          </w:rPr>
+          <w:t>Public overview</w:t>
+        </w:r>
+      </w:hyperlink>
+    </w:p>
+    <w:p>
+      <w:pPr>
+        <w:pStyle w:val="CVBullet"/>
+      </w:pPr>
+      <w:r>
+        <w:t xml:space="preserve">• </w:t>
+      </w:r>
+      <w:r>
+        <w:rPr>
+          <w:i w:val="0"/>
+        </w:rPr>
+        <w:t>I developed Gateplane independently to explore how authenticated human or agent identity becomes bounded, tenant-aware authority for tools and external effects.</w:t>
+      </w:r>
+    </w:p>
+    <w:p>
+      <w:pPr>
+        <w:pStyle w:val="CVBullet"/>
+      </w:pPr>
+      <w:r>
+        <w:t xml:space="preserve">• </w:t>
+      </w:r>
+      <w:r>
+        <w:rPr>
+          <w:i w:val="0"/>
+        </w:rPr>
+        <w:t>Uses isolated run workspaces, declared outputs, and deterministic gates around model-proposed work.</w:t>
+      </w:r>
+    </w:p>
+    <w:p>
+      <w:pPr>
+        <w:pStyle w:val="Heading2"/>
+      </w:pPr>
+      <w:r>
+        <w:t>DG-OS</w:t>
+      </w:r>
+    </w:p>
+    <w:p>
+      <w:pPr>
+        <w:spacing w:after="40"/>
+      </w:pPr>
+      <w:r>
+        <w:rPr>
+          <w:i/>
+        </w:rPr>
+        <w:t xml:space="preserve">Open-source public system · Active · </w:t>
+      </w:r>
+      <w:hyperlink r:id="rId17">
+        <w:r>
+          <w:rPr>
+            <w:color w:val="2E74B5"/>
+            <w:u w:val="single"/>
+            <w:i/>
+          </w:rPr>
+          <w:t>Repository</w:t>
+        </w:r>
+      </w:hyperlink>
+    </w:p>
+    <w:p>
+      <w:pPr>
+        <w:pStyle w:val="CVBullet"/>
+      </w:pPr>
+      <w:r>
+        <w:t xml:space="preserve">• </w:t>
+      </w:r>
+      <w:r>
+        <w:rPr>
+          <w:i w:val="0"/>
+        </w:rPr>
+        <w:t>I built DG-OS as a stand-alone public profile and discovery product where visitors can inspect a person's systems, evidence, writing, and development or ask questions grounded in reviewed public sources.</w:t>
+      </w:r>
+    </w:p>
+    <w:p>
+      <w:pPr>
+        <w:pStyle w:val="CVBullet"/>
+      </w:pPr>
+      <w:r>
+        <w:t xml:space="preserve">• </w:t>
+      </w:r>
+      <w:r>
+        <w:rPr>
+          <w:i w:val="0"/>
+        </w:rPr>
+        <w:t>Creates independent value as a richer alternative to a static CV or portfolio, with navigable systems, evidence, writing, development history, and a source-grounded Profile Agent.</w:t>
       </w:r>
     </w:p>
     <w:p>
@@ -704,12 +689,6 @@
         </w:rPr>
         <w:t>University of York</w:t>
       </w:r>
-      <w:r>
-        <w:rPr>
-          <w:i w:val="0"/>
-        </w:rPr>
-        <w:t xml:space="preserve"> · 2009 - 2011</w:t>
-      </w:r>
     </w:p>
     <w:p>
       <w:pPr>
@@ -729,12 +708,6 @@
           <w:i w:val="0"/>
         </w:rPr>
         <w:t>Sofia University</w:t>
-      </w:r>
-      <w:r>
-        <w:rPr>
-          <w:i w:val="0"/>
-        </w:rPr>
-        <w:t xml:space="preserve"> · 2003 - 2007</w:t>
       </w:r>
     </w:p>
     <w:sectPr>

</xml_diff>